<commit_message>
fix: correct template syntax in weekly_plan_template.docx
</commit_message>
<xml_diff>
--- a/middleware-with-database/app/features/weekly_plan/templates/weekly_plan_template.docx
+++ b/middleware-with-database/app/features/weekly_plan/templates/weekly_plan_template.docx
@@ -805,7 +805,7 @@
                 <w:w w:val="115"/>
                 <w:sz w:val="15"/>
               </w:rPr>
-              <w:t>{%tr for tp in tujuan_pembelajaran %}</w:t>
+              <w:t>{% for tp in tujuan_pembelajaran %}</w:t>
             </w:r>
             <w:r>
               <w:rPr>
@@ -841,7 +841,7 @@
                 <w:w w:val="115"/>
                 <w:sz w:val="15"/>
               </w:rPr>
-              <w:t>{%tr endfor %}</w:t>
+              <w:t>{% endfor %}</w:t>
             </w:r>
           </w:p>
         </w:tc>

</xml_diff>

<commit_message>
fix: update template in weekly plan document
</commit_message>
<xml_diff>
--- a/middleware-with-database/app/features/weekly_plan/templates/weekly_plan_template.docx
+++ b/middleware-with-database/app/features/weekly_plan/templates/weekly_plan_template.docx
@@ -204,7 +204,7 @@
           </mc:Choice>
           <mc:Fallback>
             <w:pict>
-              <v:shape w14:anchorId="725C57B9" id="Graphic 2" o:spid="_x0000_s1026" style="position:absolute;margin-left:19.5pt;margin-top:11.85pt;width:803.4pt;height:1.3pt;z-index:-15728640;visibility:visible;mso-wrap-style:square;mso-wrap-distance-left:0;mso-wrap-distance-top:0;mso-wrap-distance-right:0;mso-wrap-distance-bottom:0;mso-position-horizontal:absolute;mso-position-horizontal-relative:page;mso-position-vertical:absolute;mso-position-vertical-relative:text;v-text-anchor:top" coordsize="10203180,16510" o:gfxdata="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" path="m10202647,r-8141,l8128,,,,,8128r,8128l8128,16256r10186378,l10202647,16256r,-8128l10202647,xe" fillcolor="black" stroked="f">
+              <v:shape w14:anchorId="58FB3657" id="Graphic 2" o:spid="_x0000_s1026" style="position:absolute;margin-left:19.5pt;margin-top:11.85pt;width:803.4pt;height:1.3pt;z-index:-15728640;visibility:visible;mso-wrap-style:square;mso-wrap-distance-left:0;mso-wrap-distance-top:0;mso-wrap-distance-right:0;mso-wrap-distance-bottom:0;mso-position-horizontal:absolute;mso-position-horizontal-relative:page;mso-position-vertical:absolute;mso-position-vertical-relative:text;v-text-anchor:top" coordsize="10203180,16510" o:gfxdata="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" path="m10202647,r-8141,l8128,,,,,8128r,8128l8128,16256r10186378,l10202647,16256r,-8128l10202647,xe" fillcolor="black" stroked="f">
                 <v:path arrowok="t"/>
                 <w10:wrap type="topAndBottom" anchorx="page"/>
               </v:shape>
@@ -685,8 +685,9 @@
         </w:tblBorders>
         <w:tblLayout w:type="fixed"/>
         <w:tblCellMar>
-          <w:left w:w="0" w:type="dxa"/>
-          <w:right w:w="0" w:type="dxa"/>
+          <w:left w:w="28" w:type="dxa"/>
+          <w:bottom w:w="28" w:type="dxa"/>
+          <w:right w:w="28" w:type="dxa"/>
         </w:tblCellMar>
         <w:tblLook w:val="01E0" w:firstRow="1" w:lastRow="1" w:firstColumn="1" w:lastColumn="1" w:noHBand="0" w:noVBand="0"/>
       </w:tblPr>
@@ -813,11 +814,13 @@
         <w:tc>
           <w:tcPr>
             <w:tcW w:w="8847" w:type="dxa"/>
+            <w:vAlign w:val="center"/>
           </w:tcPr>
           <w:p>
             <w:pPr>
               <w:pStyle w:val="TableParagraph"/>
               <w:ind w:left="107"/>
+              <w:jc w:val="left"/>
               <w:rPr>
                 <w:sz w:val="15"/>
               </w:rPr>
@@ -854,6 +857,7 @@
         <w:tc>
           <w:tcPr>
             <w:tcW w:w="8847" w:type="dxa"/>
+            <w:vAlign w:val="center"/>
           </w:tcPr>
           <w:p>
             <w:pPr>
@@ -901,6 +905,7 @@
         <w:tc>
           <w:tcPr>
             <w:tcW w:w="8847" w:type="dxa"/>
+            <w:vAlign w:val="center"/>
           </w:tcPr>
           <w:p>
             <w:pPr>
@@ -1133,12 +1138,12 @@
         <w:tc>
           <w:tcPr>
             <w:tcW w:w="1613" w:type="dxa"/>
+            <w:vAlign w:val="center"/>
           </w:tcPr>
           <w:p>
             <w:pPr>
               <w:pStyle w:val="TableParagraph"/>
               <w:ind w:left="286"/>
-              <w:jc w:val="left"/>
               <w:rPr>
                 <w:sz w:val="15"/>
               </w:rPr>
@@ -1170,12 +1175,12 @@
         <w:tc>
           <w:tcPr>
             <w:tcW w:w="3213" w:type="dxa"/>
+            <w:vAlign w:val="center"/>
           </w:tcPr>
           <w:p>
             <w:pPr>
               <w:pStyle w:val="TableParagraph"/>
               <w:ind w:left="0"/>
-              <w:jc w:val="left"/>
               <w:rPr>
                 <w:sz w:val="15"/>
               </w:rPr>
@@ -1185,12 +1190,12 @@
         <w:tc>
           <w:tcPr>
             <w:tcW w:w="3200" w:type="dxa"/>
+            <w:vAlign w:val="center"/>
           </w:tcPr>
           <w:p>
             <w:pPr>
               <w:pStyle w:val="TableParagraph"/>
               <w:ind w:left="0"/>
-              <w:jc w:val="left"/>
               <w:rPr>
                 <w:sz w:val="15"/>
               </w:rPr>
@@ -1220,9 +1225,21 @@
         <w:tc>
           <w:tcPr>
             <w:tcW w:w="1613" w:type="dxa"/>
-          </w:tcPr>
-          <w:p>
-            <w:r>
+            <w:vAlign w:val="center"/>
+          </w:tcPr>
+          <w:p>
+            <w:pPr>
+              <w:jc w:val="center"/>
+              <w:rPr>
+                <w:sz w:val="15"/>
+                <w:szCs w:val="15"/>
+              </w:rPr>
+            </w:pPr>
+            <w:r>
+              <w:rPr>
+                <w:sz w:val="15"/>
+                <w:szCs w:val="15"/>
+              </w:rPr>
               <w:t>{{ line.waktu }}</w:t>
             </w:r>
           </w:p>
@@ -1232,7 +1249,17 @@
             <w:tcW w:w="4826" w:type="dxa"/>
           </w:tcPr>
           <w:p>
-            <w:r>
+            <w:pPr>
+              <w:rPr>
+                <w:sz w:val="15"/>
+                <w:szCs w:val="15"/>
+              </w:rPr>
+            </w:pPr>
+            <w:r>
+              <w:rPr>
+                <w:sz w:val="15"/>
+                <w:szCs w:val="15"/>
+              </w:rPr>
               <w:t>{{ line.aktivitas }}</w:t>
             </w:r>
           </w:p>
@@ -1240,9 +1267,21 @@
         <w:tc>
           <w:tcPr>
             <w:tcW w:w="3213" w:type="dxa"/>
-          </w:tcPr>
-          <w:p>
-            <w:r>
+            <w:vAlign w:val="center"/>
+          </w:tcPr>
+          <w:p>
+            <w:pPr>
+              <w:jc w:val="center"/>
+              <w:rPr>
+                <w:sz w:val="15"/>
+                <w:szCs w:val="15"/>
+              </w:rPr>
+            </w:pPr>
+            <w:r>
+              <w:rPr>
+                <w:sz w:val="15"/>
+                <w:szCs w:val="15"/>
+              </w:rPr>
               <w:t>{{ line.media }}</w:t>
             </w:r>
           </w:p>
@@ -1250,9 +1289,21 @@
         <w:tc>
           <w:tcPr>
             <w:tcW w:w="3200" w:type="dxa"/>
-          </w:tcPr>
-          <w:p>
-            <w:r>
+            <w:vAlign w:val="center"/>
+          </w:tcPr>
+          <w:p>
+            <w:pPr>
+              <w:jc w:val="center"/>
+              <w:rPr>
+                <w:sz w:val="15"/>
+                <w:szCs w:val="15"/>
+              </w:rPr>
+            </w:pPr>
+            <w:r>
+              <w:rPr>
+                <w:sz w:val="15"/>
+                <w:szCs w:val="15"/>
+              </w:rPr>
               <w:t>{{ line.sumber }}</w:t>
             </w:r>
           </w:p>
@@ -1260,9 +1311,20 @@
         <w:tc>
           <w:tcPr>
             <w:tcW w:w="3200" w:type="dxa"/>
-          </w:tcPr>
-          <w:p>
-            <w:r>
+            <w:vAlign w:val="center"/>
+          </w:tcPr>
+          <w:p>
+            <w:pPr>
+              <w:rPr>
+                <w:sz w:val="15"/>
+                <w:szCs w:val="15"/>
+              </w:rPr>
+            </w:pPr>
+            <w:r>
+              <w:rPr>
+                <w:sz w:val="15"/>
+                <w:szCs w:val="15"/>
+              </w:rPr>
               <w:t>{{ line.penilaian }}</w:t>
             </w:r>
           </w:p>
@@ -1275,9 +1337,21 @@
         <w:tc>
           <w:tcPr>
             <w:tcW w:w="1613" w:type="dxa"/>
-          </w:tcPr>
-          <w:p>
-            <w:r>
+            <w:vAlign w:val="center"/>
+          </w:tcPr>
+          <w:p>
+            <w:pPr>
+              <w:jc w:val="center"/>
+              <w:rPr>
+                <w:sz w:val="15"/>
+                <w:szCs w:val="15"/>
+              </w:rPr>
+            </w:pPr>
+            <w:r>
+              <w:rPr>
+                <w:sz w:val="15"/>
+                <w:szCs w:val="15"/>
+              </w:rPr>
               <w:t>{%tr endfor %}</w:t>
             </w:r>
           </w:p>
@@ -1286,25 +1360,57 @@
           <w:tcPr>
             <w:tcW w:w="4826" w:type="dxa"/>
           </w:tcPr>
-          <w:p/>
+          <w:p>
+            <w:pPr>
+              <w:rPr>
+                <w:sz w:val="15"/>
+                <w:szCs w:val="15"/>
+              </w:rPr>
+            </w:pPr>
+          </w:p>
         </w:tc>
         <w:tc>
           <w:tcPr>
             <w:tcW w:w="3213" w:type="dxa"/>
-          </w:tcPr>
-          <w:p/>
+            <w:vAlign w:val="center"/>
+          </w:tcPr>
+          <w:p>
+            <w:pPr>
+              <w:jc w:val="center"/>
+              <w:rPr>
+                <w:sz w:val="15"/>
+                <w:szCs w:val="15"/>
+              </w:rPr>
+            </w:pPr>
+          </w:p>
         </w:tc>
         <w:tc>
           <w:tcPr>
             <w:tcW w:w="3200" w:type="dxa"/>
-          </w:tcPr>
-          <w:p/>
+            <w:vAlign w:val="center"/>
+          </w:tcPr>
+          <w:p>
+            <w:pPr>
+              <w:jc w:val="center"/>
+              <w:rPr>
+                <w:sz w:val="15"/>
+                <w:szCs w:val="15"/>
+              </w:rPr>
+            </w:pPr>
+          </w:p>
         </w:tc>
         <w:tc>
           <w:tcPr>
             <w:tcW w:w="3200" w:type="dxa"/>
           </w:tcPr>
-          <w:p/>
+          <w:p>
+            <w:pPr>
+              <w:rPr>
+                <w:sz w:val="15"/>
+                <w:szCs w:val="15"/>
+              </w:rPr>
+            </w:pPr>
+          </w:p>
         </w:tc>
       </w:tr>
     </w:tbl>
@@ -1528,12 +1634,12 @@
         <w:tc>
           <w:tcPr>
             <w:tcW w:w="1613" w:type="dxa"/>
+            <w:vAlign w:val="center"/>
           </w:tcPr>
           <w:p>
             <w:pPr>
               <w:pStyle w:val="TableParagraph"/>
               <w:ind w:left="286"/>
-              <w:jc w:val="left"/>
               <w:rPr>
                 <w:sz w:val="15"/>
               </w:rPr>
@@ -1564,11 +1670,11 @@
         <w:tc>
           <w:tcPr>
             <w:tcW w:w="3213" w:type="dxa"/>
-          </w:tcPr>
-          <w:p>
-            <w:pPr>
-              <w:pStyle w:val="TableParagraph"/>
-              <w:jc w:val="left"/>
+            <w:vAlign w:val="center"/>
+          </w:tcPr>
+          <w:p>
+            <w:pPr>
+              <w:pStyle w:val="TableParagraph"/>
               <w:rPr>
                 <w:sz w:val="15"/>
               </w:rPr>
@@ -1578,11 +1684,11 @@
         <w:tc>
           <w:tcPr>
             <w:tcW w:w="3200" w:type="dxa"/>
-          </w:tcPr>
-          <w:p>
-            <w:pPr>
-              <w:pStyle w:val="TableParagraph"/>
-              <w:jc w:val="left"/>
+            <w:vAlign w:val="center"/>
+          </w:tcPr>
+          <w:p>
+            <w:pPr>
+              <w:pStyle w:val="TableParagraph"/>
               <w:rPr>
                 <w:sz w:val="15"/>
               </w:rPr>
@@ -1592,6 +1698,7 @@
         <w:tc>
           <w:tcPr>
             <w:tcW w:w="3200" w:type="dxa"/>
+            <w:vAlign w:val="center"/>
           </w:tcPr>
           <w:p>
             <w:pPr>
@@ -1612,9 +1719,21 @@
         <w:tc>
           <w:tcPr>
             <w:tcW w:w="1613" w:type="dxa"/>
-          </w:tcPr>
-          <w:p>
-            <w:r>
+            <w:vAlign w:val="center"/>
+          </w:tcPr>
+          <w:p>
+            <w:pPr>
+              <w:jc w:val="center"/>
+              <w:rPr>
+                <w:sz w:val="15"/>
+                <w:szCs w:val="15"/>
+              </w:rPr>
+            </w:pPr>
+            <w:r>
+              <w:rPr>
+                <w:sz w:val="15"/>
+                <w:szCs w:val="15"/>
+              </w:rPr>
               <w:t>{{ line.waktu }}</w:t>
             </w:r>
           </w:p>
@@ -1624,7 +1743,17 @@
             <w:tcW w:w="4826" w:type="dxa"/>
           </w:tcPr>
           <w:p>
-            <w:r>
+            <w:pPr>
+              <w:rPr>
+                <w:sz w:val="15"/>
+                <w:szCs w:val="15"/>
+              </w:rPr>
+            </w:pPr>
+            <w:r>
+              <w:rPr>
+                <w:sz w:val="15"/>
+                <w:szCs w:val="15"/>
+              </w:rPr>
               <w:t>{{ line.aktivitas }}</w:t>
             </w:r>
           </w:p>
@@ -1632,9 +1761,21 @@
         <w:tc>
           <w:tcPr>
             <w:tcW w:w="3213" w:type="dxa"/>
-          </w:tcPr>
-          <w:p>
-            <w:r>
+            <w:vAlign w:val="center"/>
+          </w:tcPr>
+          <w:p>
+            <w:pPr>
+              <w:jc w:val="center"/>
+              <w:rPr>
+                <w:sz w:val="15"/>
+                <w:szCs w:val="15"/>
+              </w:rPr>
+            </w:pPr>
+            <w:r>
+              <w:rPr>
+                <w:sz w:val="15"/>
+                <w:szCs w:val="15"/>
+              </w:rPr>
               <w:t>{{ line.media }}</w:t>
             </w:r>
           </w:p>
@@ -1642,9 +1783,21 @@
         <w:tc>
           <w:tcPr>
             <w:tcW w:w="3200" w:type="dxa"/>
-          </w:tcPr>
-          <w:p>
-            <w:r>
+            <w:vAlign w:val="center"/>
+          </w:tcPr>
+          <w:p>
+            <w:pPr>
+              <w:jc w:val="center"/>
+              <w:rPr>
+                <w:sz w:val="15"/>
+                <w:szCs w:val="15"/>
+              </w:rPr>
+            </w:pPr>
+            <w:r>
+              <w:rPr>
+                <w:sz w:val="15"/>
+                <w:szCs w:val="15"/>
+              </w:rPr>
               <w:t>{{ line.sumber }}</w:t>
             </w:r>
           </w:p>
@@ -1652,9 +1805,20 @@
         <w:tc>
           <w:tcPr>
             <w:tcW w:w="3200" w:type="dxa"/>
-          </w:tcPr>
-          <w:p>
-            <w:r>
+            <w:vAlign w:val="center"/>
+          </w:tcPr>
+          <w:p>
+            <w:pPr>
+              <w:rPr>
+                <w:sz w:val="15"/>
+                <w:szCs w:val="15"/>
+              </w:rPr>
+            </w:pPr>
+            <w:r>
+              <w:rPr>
+                <w:sz w:val="15"/>
+                <w:szCs w:val="15"/>
+              </w:rPr>
               <w:t>{{ line.penilaian }}</w:t>
             </w:r>
           </w:p>
@@ -1667,9 +1831,21 @@
         <w:tc>
           <w:tcPr>
             <w:tcW w:w="1613" w:type="dxa"/>
-          </w:tcPr>
-          <w:p>
-            <w:r>
+            <w:vAlign w:val="center"/>
+          </w:tcPr>
+          <w:p>
+            <w:pPr>
+              <w:jc w:val="center"/>
+              <w:rPr>
+                <w:sz w:val="15"/>
+                <w:szCs w:val="15"/>
+              </w:rPr>
+            </w:pPr>
+            <w:r>
+              <w:rPr>
+                <w:sz w:val="15"/>
+                <w:szCs w:val="15"/>
+              </w:rPr>
               <w:t>{%tr endfor %}</w:t>
             </w:r>
           </w:p>
@@ -1678,25 +1854,58 @@
           <w:tcPr>
             <w:tcW w:w="4826" w:type="dxa"/>
           </w:tcPr>
-          <w:p/>
+          <w:p>
+            <w:pPr>
+              <w:rPr>
+                <w:sz w:val="15"/>
+                <w:szCs w:val="15"/>
+              </w:rPr>
+            </w:pPr>
+          </w:p>
         </w:tc>
         <w:tc>
           <w:tcPr>
             <w:tcW w:w="3213" w:type="dxa"/>
-          </w:tcPr>
-          <w:p/>
+            <w:vAlign w:val="center"/>
+          </w:tcPr>
+          <w:p>
+            <w:pPr>
+              <w:jc w:val="center"/>
+              <w:rPr>
+                <w:sz w:val="15"/>
+                <w:szCs w:val="15"/>
+              </w:rPr>
+            </w:pPr>
+          </w:p>
         </w:tc>
         <w:tc>
           <w:tcPr>
             <w:tcW w:w="3200" w:type="dxa"/>
-          </w:tcPr>
-          <w:p/>
+            <w:vAlign w:val="center"/>
+          </w:tcPr>
+          <w:p>
+            <w:pPr>
+              <w:jc w:val="center"/>
+              <w:rPr>
+                <w:sz w:val="15"/>
+                <w:szCs w:val="15"/>
+              </w:rPr>
+            </w:pPr>
+          </w:p>
         </w:tc>
         <w:tc>
           <w:tcPr>
             <w:tcW w:w="3200" w:type="dxa"/>
-          </w:tcPr>
-          <w:p/>
+            <w:vAlign w:val="center"/>
+          </w:tcPr>
+          <w:p>
+            <w:pPr>
+              <w:rPr>
+                <w:sz w:val="15"/>
+                <w:szCs w:val="15"/>
+              </w:rPr>
+            </w:pPr>
+          </w:p>
         </w:tc>
       </w:tr>
     </w:tbl>
@@ -1921,12 +2130,12 @@
         <w:tc>
           <w:tcPr>
             <w:tcW w:w="1613" w:type="dxa"/>
+            <w:vAlign w:val="center"/>
           </w:tcPr>
           <w:p>
             <w:pPr>
               <w:pStyle w:val="TableParagraph"/>
               <w:ind w:left="286"/>
-              <w:jc w:val="left"/>
               <w:rPr>
                 <w:sz w:val="15"/>
               </w:rPr>
@@ -1957,11 +2166,11 @@
         <w:tc>
           <w:tcPr>
             <w:tcW w:w="3213" w:type="dxa"/>
-          </w:tcPr>
-          <w:p>
-            <w:pPr>
-              <w:pStyle w:val="TableParagraph"/>
-              <w:jc w:val="left"/>
+            <w:vAlign w:val="center"/>
+          </w:tcPr>
+          <w:p>
+            <w:pPr>
+              <w:pStyle w:val="TableParagraph"/>
               <w:rPr>
                 <w:sz w:val="15"/>
               </w:rPr>
@@ -1971,11 +2180,11 @@
         <w:tc>
           <w:tcPr>
             <w:tcW w:w="3200" w:type="dxa"/>
-          </w:tcPr>
-          <w:p>
-            <w:pPr>
-              <w:pStyle w:val="TableParagraph"/>
-              <w:jc w:val="left"/>
+            <w:vAlign w:val="center"/>
+          </w:tcPr>
+          <w:p>
+            <w:pPr>
+              <w:pStyle w:val="TableParagraph"/>
               <w:rPr>
                 <w:sz w:val="15"/>
               </w:rPr>
@@ -1985,6 +2194,7 @@
         <w:tc>
           <w:tcPr>
             <w:tcW w:w="3200" w:type="dxa"/>
+            <w:vAlign w:val="center"/>
           </w:tcPr>
           <w:p>
             <w:pPr>
@@ -2005,9 +2215,21 @@
         <w:tc>
           <w:tcPr>
             <w:tcW w:w="1613" w:type="dxa"/>
-          </w:tcPr>
-          <w:p>
-            <w:r>
+            <w:vAlign w:val="center"/>
+          </w:tcPr>
+          <w:p>
+            <w:pPr>
+              <w:jc w:val="center"/>
+              <w:rPr>
+                <w:sz w:val="15"/>
+                <w:szCs w:val="15"/>
+              </w:rPr>
+            </w:pPr>
+            <w:r>
+              <w:rPr>
+                <w:sz w:val="15"/>
+                <w:szCs w:val="15"/>
+              </w:rPr>
               <w:t>{{ line.waktu }}</w:t>
             </w:r>
           </w:p>
@@ -2017,7 +2239,17 @@
             <w:tcW w:w="4826" w:type="dxa"/>
           </w:tcPr>
           <w:p>
-            <w:r>
+            <w:pPr>
+              <w:rPr>
+                <w:sz w:val="15"/>
+                <w:szCs w:val="15"/>
+              </w:rPr>
+            </w:pPr>
+            <w:r>
+              <w:rPr>
+                <w:sz w:val="15"/>
+                <w:szCs w:val="15"/>
+              </w:rPr>
               <w:t>{{ line.aktivitas }}</w:t>
             </w:r>
           </w:p>
@@ -2025,9 +2257,21 @@
         <w:tc>
           <w:tcPr>
             <w:tcW w:w="3213" w:type="dxa"/>
-          </w:tcPr>
-          <w:p>
-            <w:r>
+            <w:vAlign w:val="center"/>
+          </w:tcPr>
+          <w:p>
+            <w:pPr>
+              <w:jc w:val="center"/>
+              <w:rPr>
+                <w:sz w:val="15"/>
+                <w:szCs w:val="15"/>
+              </w:rPr>
+            </w:pPr>
+            <w:r>
+              <w:rPr>
+                <w:sz w:val="15"/>
+                <w:szCs w:val="15"/>
+              </w:rPr>
               <w:t>{{ line.media }}</w:t>
             </w:r>
           </w:p>
@@ -2035,9 +2279,21 @@
         <w:tc>
           <w:tcPr>
             <w:tcW w:w="3200" w:type="dxa"/>
-          </w:tcPr>
-          <w:p>
-            <w:r>
+            <w:vAlign w:val="center"/>
+          </w:tcPr>
+          <w:p>
+            <w:pPr>
+              <w:jc w:val="center"/>
+              <w:rPr>
+                <w:sz w:val="15"/>
+                <w:szCs w:val="15"/>
+              </w:rPr>
+            </w:pPr>
+            <w:r>
+              <w:rPr>
+                <w:sz w:val="15"/>
+                <w:szCs w:val="15"/>
+              </w:rPr>
               <w:t>{{ line.sumber }}</w:t>
             </w:r>
           </w:p>
@@ -2045,9 +2301,20 @@
         <w:tc>
           <w:tcPr>
             <w:tcW w:w="3200" w:type="dxa"/>
-          </w:tcPr>
-          <w:p>
-            <w:r>
+            <w:vAlign w:val="center"/>
+          </w:tcPr>
+          <w:p>
+            <w:pPr>
+              <w:rPr>
+                <w:sz w:val="15"/>
+                <w:szCs w:val="15"/>
+              </w:rPr>
+            </w:pPr>
+            <w:r>
+              <w:rPr>
+                <w:sz w:val="15"/>
+                <w:szCs w:val="15"/>
+              </w:rPr>
               <w:t>{{ line.penilaian }}</w:t>
             </w:r>
           </w:p>
@@ -2060,9 +2327,21 @@
         <w:tc>
           <w:tcPr>
             <w:tcW w:w="1613" w:type="dxa"/>
-          </w:tcPr>
-          <w:p>
-            <w:r>
+            <w:vAlign w:val="center"/>
+          </w:tcPr>
+          <w:p>
+            <w:pPr>
+              <w:jc w:val="center"/>
+              <w:rPr>
+                <w:sz w:val="15"/>
+                <w:szCs w:val="15"/>
+              </w:rPr>
+            </w:pPr>
+            <w:r>
+              <w:rPr>
+                <w:sz w:val="15"/>
+                <w:szCs w:val="15"/>
+              </w:rPr>
               <w:t>{%tr endfor %}</w:t>
             </w:r>
           </w:p>
@@ -2071,25 +2350,58 @@
           <w:tcPr>
             <w:tcW w:w="4826" w:type="dxa"/>
           </w:tcPr>
-          <w:p/>
+          <w:p>
+            <w:pPr>
+              <w:rPr>
+                <w:sz w:val="15"/>
+                <w:szCs w:val="15"/>
+              </w:rPr>
+            </w:pPr>
+          </w:p>
         </w:tc>
         <w:tc>
           <w:tcPr>
             <w:tcW w:w="3213" w:type="dxa"/>
-          </w:tcPr>
-          <w:p/>
+            <w:vAlign w:val="center"/>
+          </w:tcPr>
+          <w:p>
+            <w:pPr>
+              <w:jc w:val="center"/>
+              <w:rPr>
+                <w:sz w:val="15"/>
+                <w:szCs w:val="15"/>
+              </w:rPr>
+            </w:pPr>
+          </w:p>
         </w:tc>
         <w:tc>
           <w:tcPr>
             <w:tcW w:w="3200" w:type="dxa"/>
-          </w:tcPr>
-          <w:p/>
+            <w:vAlign w:val="center"/>
+          </w:tcPr>
+          <w:p>
+            <w:pPr>
+              <w:jc w:val="center"/>
+              <w:rPr>
+                <w:sz w:val="15"/>
+                <w:szCs w:val="15"/>
+              </w:rPr>
+            </w:pPr>
+          </w:p>
         </w:tc>
         <w:tc>
           <w:tcPr>
             <w:tcW w:w="3200" w:type="dxa"/>
-          </w:tcPr>
-          <w:p/>
+            <w:vAlign w:val="center"/>
+          </w:tcPr>
+          <w:p>
+            <w:pPr>
+              <w:rPr>
+                <w:sz w:val="15"/>
+                <w:szCs w:val="15"/>
+              </w:rPr>
+            </w:pPr>
+          </w:p>
         </w:tc>
       </w:tr>
     </w:tbl>
@@ -2322,12 +2634,12 @@
         <w:tc>
           <w:tcPr>
             <w:tcW w:w="1613" w:type="dxa"/>
+            <w:vAlign w:val="center"/>
           </w:tcPr>
           <w:p>
             <w:pPr>
               <w:pStyle w:val="TableParagraph"/>
               <w:ind w:left="286"/>
-              <w:jc w:val="left"/>
               <w:rPr>
                 <w:sz w:val="15"/>
               </w:rPr>
@@ -2358,11 +2670,11 @@
         <w:tc>
           <w:tcPr>
             <w:tcW w:w="3213" w:type="dxa"/>
-          </w:tcPr>
-          <w:p>
-            <w:pPr>
-              <w:pStyle w:val="TableParagraph"/>
-              <w:jc w:val="left"/>
+            <w:vAlign w:val="center"/>
+          </w:tcPr>
+          <w:p>
+            <w:pPr>
+              <w:pStyle w:val="TableParagraph"/>
               <w:rPr>
                 <w:sz w:val="15"/>
               </w:rPr>
@@ -2372,11 +2684,11 @@
         <w:tc>
           <w:tcPr>
             <w:tcW w:w="3200" w:type="dxa"/>
-          </w:tcPr>
-          <w:p>
-            <w:pPr>
-              <w:pStyle w:val="TableParagraph"/>
-              <w:jc w:val="left"/>
+            <w:vAlign w:val="center"/>
+          </w:tcPr>
+          <w:p>
+            <w:pPr>
+              <w:pStyle w:val="TableParagraph"/>
               <w:rPr>
                 <w:sz w:val="15"/>
               </w:rPr>
@@ -2386,6 +2698,7 @@
         <w:tc>
           <w:tcPr>
             <w:tcW w:w="3200" w:type="dxa"/>
+            <w:vAlign w:val="center"/>
           </w:tcPr>
           <w:p>
             <w:pPr>
@@ -2406,9 +2719,21 @@
         <w:tc>
           <w:tcPr>
             <w:tcW w:w="1613" w:type="dxa"/>
-          </w:tcPr>
-          <w:p>
-            <w:r>
+            <w:vAlign w:val="center"/>
+          </w:tcPr>
+          <w:p>
+            <w:pPr>
+              <w:jc w:val="center"/>
+              <w:rPr>
+                <w:sz w:val="15"/>
+                <w:szCs w:val="15"/>
+              </w:rPr>
+            </w:pPr>
+            <w:r>
+              <w:rPr>
+                <w:sz w:val="15"/>
+                <w:szCs w:val="15"/>
+              </w:rPr>
               <w:t>{{ line.waktu }}</w:t>
             </w:r>
           </w:p>
@@ -2418,7 +2743,17 @@
             <w:tcW w:w="4826" w:type="dxa"/>
           </w:tcPr>
           <w:p>
-            <w:r>
+            <w:pPr>
+              <w:rPr>
+                <w:sz w:val="15"/>
+                <w:szCs w:val="15"/>
+              </w:rPr>
+            </w:pPr>
+            <w:r>
+              <w:rPr>
+                <w:sz w:val="15"/>
+                <w:szCs w:val="15"/>
+              </w:rPr>
               <w:t>{{ line.aktivitas }}</w:t>
             </w:r>
           </w:p>
@@ -2426,9 +2761,21 @@
         <w:tc>
           <w:tcPr>
             <w:tcW w:w="3213" w:type="dxa"/>
-          </w:tcPr>
-          <w:p>
-            <w:r>
+            <w:vAlign w:val="center"/>
+          </w:tcPr>
+          <w:p>
+            <w:pPr>
+              <w:jc w:val="center"/>
+              <w:rPr>
+                <w:sz w:val="15"/>
+                <w:szCs w:val="15"/>
+              </w:rPr>
+            </w:pPr>
+            <w:r>
+              <w:rPr>
+                <w:sz w:val="15"/>
+                <w:szCs w:val="15"/>
+              </w:rPr>
               <w:t>{{ line.media }}</w:t>
             </w:r>
           </w:p>
@@ -2436,9 +2783,21 @@
         <w:tc>
           <w:tcPr>
             <w:tcW w:w="3200" w:type="dxa"/>
-          </w:tcPr>
-          <w:p>
-            <w:r>
+            <w:vAlign w:val="center"/>
+          </w:tcPr>
+          <w:p>
+            <w:pPr>
+              <w:jc w:val="center"/>
+              <w:rPr>
+                <w:sz w:val="15"/>
+                <w:szCs w:val="15"/>
+              </w:rPr>
+            </w:pPr>
+            <w:r>
+              <w:rPr>
+                <w:sz w:val="15"/>
+                <w:szCs w:val="15"/>
+              </w:rPr>
               <w:t>{{ line.sumber }}</w:t>
             </w:r>
           </w:p>
@@ -2446,9 +2805,20 @@
         <w:tc>
           <w:tcPr>
             <w:tcW w:w="3200" w:type="dxa"/>
-          </w:tcPr>
-          <w:p>
-            <w:r>
+            <w:vAlign w:val="center"/>
+          </w:tcPr>
+          <w:p>
+            <w:pPr>
+              <w:rPr>
+                <w:sz w:val="15"/>
+                <w:szCs w:val="15"/>
+              </w:rPr>
+            </w:pPr>
+            <w:r>
+              <w:rPr>
+                <w:sz w:val="15"/>
+                <w:szCs w:val="15"/>
+              </w:rPr>
               <w:t>{{ line.penilaian }}</w:t>
             </w:r>
           </w:p>
@@ -2461,9 +2831,21 @@
         <w:tc>
           <w:tcPr>
             <w:tcW w:w="1613" w:type="dxa"/>
-          </w:tcPr>
-          <w:p>
-            <w:r>
+            <w:vAlign w:val="center"/>
+          </w:tcPr>
+          <w:p>
+            <w:pPr>
+              <w:jc w:val="center"/>
+              <w:rPr>
+                <w:sz w:val="15"/>
+                <w:szCs w:val="15"/>
+              </w:rPr>
+            </w:pPr>
+            <w:r>
+              <w:rPr>
+                <w:sz w:val="15"/>
+                <w:szCs w:val="15"/>
+              </w:rPr>
               <w:t>{%tr endfor %}</w:t>
             </w:r>
           </w:p>
@@ -2472,25 +2854,58 @@
           <w:tcPr>
             <w:tcW w:w="4826" w:type="dxa"/>
           </w:tcPr>
-          <w:p/>
+          <w:p>
+            <w:pPr>
+              <w:rPr>
+                <w:sz w:val="15"/>
+                <w:szCs w:val="15"/>
+              </w:rPr>
+            </w:pPr>
+          </w:p>
         </w:tc>
         <w:tc>
           <w:tcPr>
             <w:tcW w:w="3213" w:type="dxa"/>
-          </w:tcPr>
-          <w:p/>
+            <w:vAlign w:val="center"/>
+          </w:tcPr>
+          <w:p>
+            <w:pPr>
+              <w:jc w:val="center"/>
+              <w:rPr>
+                <w:sz w:val="15"/>
+                <w:szCs w:val="15"/>
+              </w:rPr>
+            </w:pPr>
+          </w:p>
         </w:tc>
         <w:tc>
           <w:tcPr>
             <w:tcW w:w="3200" w:type="dxa"/>
-          </w:tcPr>
-          <w:p/>
+            <w:vAlign w:val="center"/>
+          </w:tcPr>
+          <w:p>
+            <w:pPr>
+              <w:jc w:val="center"/>
+              <w:rPr>
+                <w:sz w:val="15"/>
+                <w:szCs w:val="15"/>
+              </w:rPr>
+            </w:pPr>
+          </w:p>
         </w:tc>
         <w:tc>
           <w:tcPr>
             <w:tcW w:w="3200" w:type="dxa"/>
-          </w:tcPr>
-          <w:p/>
+            <w:vAlign w:val="center"/>
+          </w:tcPr>
+          <w:p>
+            <w:pPr>
+              <w:rPr>
+                <w:sz w:val="15"/>
+                <w:szCs w:val="15"/>
+              </w:rPr>
+            </w:pPr>
+          </w:p>
         </w:tc>
       </w:tr>
     </w:tbl>
@@ -2714,12 +3129,12 @@
         <w:tc>
           <w:tcPr>
             <w:tcW w:w="1613" w:type="dxa"/>
+            <w:vAlign w:val="center"/>
           </w:tcPr>
           <w:p>
             <w:pPr>
               <w:pStyle w:val="TableParagraph"/>
               <w:ind w:left="286"/>
-              <w:jc w:val="left"/>
               <w:rPr>
                 <w:sz w:val="15"/>
               </w:rPr>
@@ -2750,11 +3165,11 @@
         <w:tc>
           <w:tcPr>
             <w:tcW w:w="3213" w:type="dxa"/>
-          </w:tcPr>
-          <w:p>
-            <w:pPr>
-              <w:pStyle w:val="TableParagraph"/>
-              <w:jc w:val="left"/>
+            <w:vAlign w:val="center"/>
+          </w:tcPr>
+          <w:p>
+            <w:pPr>
+              <w:pStyle w:val="TableParagraph"/>
               <w:rPr>
                 <w:sz w:val="15"/>
               </w:rPr>
@@ -2764,11 +3179,11 @@
         <w:tc>
           <w:tcPr>
             <w:tcW w:w="3200" w:type="dxa"/>
-          </w:tcPr>
-          <w:p>
-            <w:pPr>
-              <w:pStyle w:val="TableParagraph"/>
-              <w:jc w:val="left"/>
+            <w:vAlign w:val="center"/>
+          </w:tcPr>
+          <w:p>
+            <w:pPr>
+              <w:pStyle w:val="TableParagraph"/>
               <w:rPr>
                 <w:sz w:val="15"/>
               </w:rPr>
@@ -2778,6 +3193,7 @@
         <w:tc>
           <w:tcPr>
             <w:tcW w:w="3200" w:type="dxa"/>
+            <w:vAlign w:val="center"/>
           </w:tcPr>
           <w:p>
             <w:pPr>
@@ -2798,9 +3214,21 @@
         <w:tc>
           <w:tcPr>
             <w:tcW w:w="1613" w:type="dxa"/>
-          </w:tcPr>
-          <w:p>
-            <w:r>
+            <w:vAlign w:val="center"/>
+          </w:tcPr>
+          <w:p>
+            <w:pPr>
+              <w:jc w:val="center"/>
+              <w:rPr>
+                <w:sz w:val="15"/>
+                <w:szCs w:val="15"/>
+              </w:rPr>
+            </w:pPr>
+            <w:r>
+              <w:rPr>
+                <w:sz w:val="15"/>
+                <w:szCs w:val="15"/>
+              </w:rPr>
               <w:t>{{ line.waktu }}</w:t>
             </w:r>
           </w:p>
@@ -2810,7 +3238,17 @@
             <w:tcW w:w="4826" w:type="dxa"/>
           </w:tcPr>
           <w:p>
-            <w:r>
+            <w:pPr>
+              <w:rPr>
+                <w:sz w:val="15"/>
+                <w:szCs w:val="15"/>
+              </w:rPr>
+            </w:pPr>
+            <w:r>
+              <w:rPr>
+                <w:sz w:val="15"/>
+                <w:szCs w:val="15"/>
+              </w:rPr>
               <w:t>{{ line.aktivitas }}</w:t>
             </w:r>
           </w:p>
@@ -2818,9 +3256,21 @@
         <w:tc>
           <w:tcPr>
             <w:tcW w:w="3213" w:type="dxa"/>
-          </w:tcPr>
-          <w:p>
-            <w:r>
+            <w:vAlign w:val="center"/>
+          </w:tcPr>
+          <w:p>
+            <w:pPr>
+              <w:jc w:val="center"/>
+              <w:rPr>
+                <w:sz w:val="15"/>
+                <w:szCs w:val="15"/>
+              </w:rPr>
+            </w:pPr>
+            <w:r>
+              <w:rPr>
+                <w:sz w:val="15"/>
+                <w:szCs w:val="15"/>
+              </w:rPr>
               <w:t>{{ line.media }}</w:t>
             </w:r>
           </w:p>
@@ -2828,9 +3278,21 @@
         <w:tc>
           <w:tcPr>
             <w:tcW w:w="3200" w:type="dxa"/>
-          </w:tcPr>
-          <w:p>
-            <w:r>
+            <w:vAlign w:val="center"/>
+          </w:tcPr>
+          <w:p>
+            <w:pPr>
+              <w:jc w:val="center"/>
+              <w:rPr>
+                <w:sz w:val="15"/>
+                <w:szCs w:val="15"/>
+              </w:rPr>
+            </w:pPr>
+            <w:r>
+              <w:rPr>
+                <w:sz w:val="15"/>
+                <w:szCs w:val="15"/>
+              </w:rPr>
               <w:t>{{ line.sumber }}</w:t>
             </w:r>
           </w:p>
@@ -2838,9 +3300,20 @@
         <w:tc>
           <w:tcPr>
             <w:tcW w:w="3200" w:type="dxa"/>
-          </w:tcPr>
-          <w:p>
-            <w:r>
+            <w:vAlign w:val="center"/>
+          </w:tcPr>
+          <w:p>
+            <w:pPr>
+              <w:rPr>
+                <w:sz w:val="15"/>
+                <w:szCs w:val="15"/>
+              </w:rPr>
+            </w:pPr>
+            <w:r>
+              <w:rPr>
+                <w:sz w:val="15"/>
+                <w:szCs w:val="15"/>
+              </w:rPr>
               <w:t>{{ line.penilaian }}</w:t>
             </w:r>
           </w:p>
@@ -2853,9 +3326,21 @@
         <w:tc>
           <w:tcPr>
             <w:tcW w:w="1613" w:type="dxa"/>
-          </w:tcPr>
-          <w:p>
-            <w:r>
+            <w:vAlign w:val="center"/>
+          </w:tcPr>
+          <w:p>
+            <w:pPr>
+              <w:jc w:val="center"/>
+              <w:rPr>
+                <w:sz w:val="15"/>
+                <w:szCs w:val="15"/>
+              </w:rPr>
+            </w:pPr>
+            <w:r>
+              <w:rPr>
+                <w:sz w:val="15"/>
+                <w:szCs w:val="15"/>
+              </w:rPr>
               <w:t>{%tr endfor %}</w:t>
             </w:r>
           </w:p>
@@ -2864,25 +3349,58 @@
           <w:tcPr>
             <w:tcW w:w="4826" w:type="dxa"/>
           </w:tcPr>
-          <w:p/>
+          <w:p>
+            <w:pPr>
+              <w:rPr>
+                <w:sz w:val="15"/>
+                <w:szCs w:val="15"/>
+              </w:rPr>
+            </w:pPr>
+          </w:p>
         </w:tc>
         <w:tc>
           <w:tcPr>
             <w:tcW w:w="3213" w:type="dxa"/>
-          </w:tcPr>
-          <w:p/>
+            <w:vAlign w:val="center"/>
+          </w:tcPr>
+          <w:p>
+            <w:pPr>
+              <w:jc w:val="center"/>
+              <w:rPr>
+                <w:sz w:val="15"/>
+                <w:szCs w:val="15"/>
+              </w:rPr>
+            </w:pPr>
+          </w:p>
         </w:tc>
         <w:tc>
           <w:tcPr>
             <w:tcW w:w="3200" w:type="dxa"/>
-          </w:tcPr>
-          <w:p/>
+            <w:vAlign w:val="center"/>
+          </w:tcPr>
+          <w:p>
+            <w:pPr>
+              <w:jc w:val="center"/>
+              <w:rPr>
+                <w:sz w:val="15"/>
+                <w:szCs w:val="15"/>
+              </w:rPr>
+            </w:pPr>
+          </w:p>
         </w:tc>
         <w:tc>
           <w:tcPr>
             <w:tcW w:w="3200" w:type="dxa"/>
-          </w:tcPr>
-          <w:p/>
+            <w:vAlign w:val="center"/>
+          </w:tcPr>
+          <w:p>
+            <w:pPr>
+              <w:rPr>
+                <w:sz w:val="15"/>
+                <w:szCs w:val="15"/>
+              </w:rPr>
+            </w:pPr>
+          </w:p>
         </w:tc>
       </w:tr>
     </w:tbl>
@@ -3306,7 +3824,7 @@
           </mc:Choice>
           <mc:Fallback>
             <w:pict>
-              <v:shape w14:anchorId="5496A666" id="Graphic 5" o:spid="_x0000_s1026" style="position:absolute;margin-left:182.75pt;margin-top:14.8pt;width:74.9pt;height:.1pt;z-index:-15726592;visibility:visible;mso-wrap-style:square;mso-wrap-distance-left:0;mso-wrap-distance-top:0;mso-wrap-distance-right:0;mso-wrap-distance-bottom:0;mso-position-horizontal:absolute;mso-position-horizontal-relative:page;mso-position-vertical:absolute;mso-position-vertical-relative:text;v-text-anchor:top" coordsize="951230,1270" o:gfxdata="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" path="m,l951163,e" filled="f" strokeweight=".20497mm">
+              <v:shape w14:anchorId="6A103194" id="Graphic 5" o:spid="_x0000_s1026" style="position:absolute;margin-left:182.75pt;margin-top:14.8pt;width:74.9pt;height:.1pt;z-index:-15726592;visibility:visible;mso-wrap-style:square;mso-wrap-distance-left:0;mso-wrap-distance-top:0;mso-wrap-distance-right:0;mso-wrap-distance-bottom:0;mso-position-horizontal:absolute;mso-position-horizontal-relative:page;mso-position-vertical:absolute;mso-position-vertical-relative:text;v-text-anchor:top" coordsize="951230,1270" o:gfxdata="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" path="m,l951163,e" filled="f" strokeweight=".20497mm">
                 <v:path arrowok="t"/>
                 <w10:wrap type="topAndBottom" anchorx="page"/>
               </v:shape>
@@ -3386,7 +3904,7 @@
           </mc:Choice>
           <mc:Fallback>
             <w:pict>
-              <v:shape w14:anchorId="2A4DD0B3" id="Graphic 6" o:spid="_x0000_s1026" style="position:absolute;margin-left:583.15pt;margin-top:14.8pt;width:74.9pt;height:.1pt;z-index:-15726080;visibility:visible;mso-wrap-style:square;mso-wrap-distance-left:0;mso-wrap-distance-top:0;mso-wrap-distance-right:0;mso-wrap-distance-bottom:0;mso-position-horizontal:absolute;mso-position-horizontal-relative:page;mso-position-vertical:absolute;mso-position-vertical-relative:text;v-text-anchor:top" coordsize="951230,1270" o:gfxdata="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" path="m,l951163,e" filled="f" strokeweight=".20497mm">
+              <v:shape w14:anchorId="557D67FA" id="Graphic 6" o:spid="_x0000_s1026" style="position:absolute;margin-left:583.15pt;margin-top:14.8pt;width:74.9pt;height:.1pt;z-index:-15726080;visibility:visible;mso-wrap-style:square;mso-wrap-distance-left:0;mso-wrap-distance-top:0;mso-wrap-distance-right:0;mso-wrap-distance-bottom:0;mso-position-horizontal:absolute;mso-position-horizontal-relative:page;mso-position-vertical:absolute;mso-position-vertical-relative:text;v-text-anchor:top" coordsize="951230,1270" o:gfxdata="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" path="m,l951163,e" filled="f" strokeweight=".20497mm">
                 <v:path arrowok="t"/>
                 <w10:wrap type="topAndBottom" anchorx="page"/>
               </v:shape>

</xml_diff>

<commit_message>
fix:update template in weekly plan
</commit_message>
<xml_diff>
--- a/middleware-with-database/app/features/weekly_plan/templates/weekly_plan_template.docx
+++ b/middleware-with-database/app/features/weekly_plan/templates/weekly_plan_template.docx
@@ -204,7 +204,7 @@
           </mc:Choice>
           <mc:Fallback>
             <w:pict>
-              <v:shape w14:anchorId="58FB3657" id="Graphic 2" o:spid="_x0000_s1026" style="position:absolute;margin-left:19.5pt;margin-top:11.85pt;width:803.4pt;height:1.3pt;z-index:-15728640;visibility:visible;mso-wrap-style:square;mso-wrap-distance-left:0;mso-wrap-distance-top:0;mso-wrap-distance-right:0;mso-wrap-distance-bottom:0;mso-position-horizontal:absolute;mso-position-horizontal-relative:page;mso-position-vertical:absolute;mso-position-vertical-relative:text;v-text-anchor:top" coordsize="10203180,16510" o:gfxdata="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" path="m10202647,r-8141,l8128,,,,,8128r,8128l8128,16256r10186378,l10202647,16256r,-8128l10202647,xe" fillcolor="black" stroked="f">
+              <v:shape w14:anchorId="048207AD" id="Graphic 2" o:spid="_x0000_s1026" style="position:absolute;margin-left:19.5pt;margin-top:11.85pt;width:803.4pt;height:1.3pt;z-index:-15728640;visibility:visible;mso-wrap-style:square;mso-wrap-distance-left:0;mso-wrap-distance-top:0;mso-wrap-distance-right:0;mso-wrap-distance-bottom:0;mso-position-horizontal:absolute;mso-position-horizontal-relative:page;mso-position-vertical:absolute;mso-position-vertical-relative:text;v-text-anchor:top" coordsize="10203180,16510" o:gfxdata="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" path="m10202647,r-8141,l8128,,,,,8128r,8128l8128,16256r10186378,l10202647,16256r,-8128l10202647,xe" fillcolor="black" stroked="f">
                 <v:path arrowok="t"/>
                 <w10:wrap type="topAndBottom" anchorx="page"/>
               </v:shape>
@@ -1160,6 +1160,7 @@
         <w:tc>
           <w:tcPr>
             <w:tcW w:w="4826" w:type="dxa"/>
+            <w:vAlign w:val="center"/>
           </w:tcPr>
           <w:p>
             <w:pPr>
@@ -1205,12 +1206,12 @@
         <w:tc>
           <w:tcPr>
             <w:tcW w:w="3200" w:type="dxa"/>
+            <w:vAlign w:val="center"/>
           </w:tcPr>
           <w:p>
             <w:pPr>
               <w:pStyle w:val="TableParagraph"/>
               <w:ind w:left="0"/>
-              <w:jc w:val="left"/>
               <w:rPr>
                 <w:sz w:val="15"/>
               </w:rPr>
@@ -1247,6 +1248,7 @@
         <w:tc>
           <w:tcPr>
             <w:tcW w:w="4826" w:type="dxa"/>
+            <w:vAlign w:val="center"/>
           </w:tcPr>
           <w:p>
             <w:pPr>
@@ -1315,6 +1317,7 @@
           </w:tcPr>
           <w:p>
             <w:pPr>
+              <w:jc w:val="center"/>
               <w:rPr>
                 <w:sz w:val="15"/>
                 <w:szCs w:val="15"/>
@@ -1359,6 +1362,7 @@
         <w:tc>
           <w:tcPr>
             <w:tcW w:w="4826" w:type="dxa"/>
+            <w:vAlign w:val="center"/>
           </w:tcPr>
           <w:p>
             <w:pPr>
@@ -1402,9 +1406,11 @@
         <w:tc>
           <w:tcPr>
             <w:tcW w:w="3200" w:type="dxa"/>
-          </w:tcPr>
-          <w:p>
-            <w:pPr>
+            <w:vAlign w:val="center"/>
+          </w:tcPr>
+          <w:p>
+            <w:pPr>
+              <w:jc w:val="center"/>
               <w:rPr>
                 <w:sz w:val="15"/>
                 <w:szCs w:val="15"/>
@@ -1656,11 +1662,13 @@
         <w:tc>
           <w:tcPr>
             <w:tcW w:w="4826" w:type="dxa"/>
+            <w:vAlign w:val="center"/>
           </w:tcPr>
           <w:p>
             <w:pPr>
               <w:pStyle w:val="TableParagraph"/>
               <w:ind w:left="17"/>
+              <w:jc w:val="left"/>
               <w:rPr>
                 <w:sz w:val="15"/>
               </w:rPr>
@@ -1704,7 +1712,6 @@
             <w:pPr>
               <w:pStyle w:val="TableParagraph"/>
               <w:ind w:left="109"/>
-              <w:jc w:val="left"/>
               <w:rPr>
                 <w:sz w:val="15"/>
               </w:rPr>
@@ -1741,6 +1748,7 @@
         <w:tc>
           <w:tcPr>
             <w:tcW w:w="4826" w:type="dxa"/>
+            <w:vAlign w:val="center"/>
           </w:tcPr>
           <w:p>
             <w:pPr>
@@ -1809,6 +1817,7 @@
           </w:tcPr>
           <w:p>
             <w:pPr>
+              <w:jc w:val="center"/>
               <w:rPr>
                 <w:sz w:val="15"/>
                 <w:szCs w:val="15"/>
@@ -1853,6 +1862,7 @@
         <w:tc>
           <w:tcPr>
             <w:tcW w:w="4826" w:type="dxa"/>
+            <w:vAlign w:val="center"/>
           </w:tcPr>
           <w:p>
             <w:pPr>
@@ -1900,6 +1910,7 @@
           </w:tcPr>
           <w:p>
             <w:pPr>
+              <w:jc w:val="center"/>
               <w:rPr>
                 <w:sz w:val="15"/>
                 <w:szCs w:val="15"/>
@@ -2152,11 +2163,13 @@
         <w:tc>
           <w:tcPr>
             <w:tcW w:w="4826" w:type="dxa"/>
+            <w:vAlign w:val="center"/>
           </w:tcPr>
           <w:p>
             <w:pPr>
               <w:pStyle w:val="TableParagraph"/>
               <w:ind w:left="17"/>
+              <w:jc w:val="left"/>
               <w:rPr>
                 <w:sz w:val="15"/>
               </w:rPr>
@@ -2200,7 +2213,6 @@
             <w:pPr>
               <w:pStyle w:val="TableParagraph"/>
               <w:ind w:left="109"/>
-              <w:jc w:val="left"/>
               <w:rPr>
                 <w:sz w:val="15"/>
               </w:rPr>
@@ -2237,6 +2249,7 @@
         <w:tc>
           <w:tcPr>
             <w:tcW w:w="4826" w:type="dxa"/>
+            <w:vAlign w:val="center"/>
           </w:tcPr>
           <w:p>
             <w:pPr>
@@ -2305,6 +2318,7 @@
           </w:tcPr>
           <w:p>
             <w:pPr>
+              <w:jc w:val="center"/>
               <w:rPr>
                 <w:sz w:val="15"/>
                 <w:szCs w:val="15"/>
@@ -2349,6 +2363,7 @@
         <w:tc>
           <w:tcPr>
             <w:tcW w:w="4826" w:type="dxa"/>
+            <w:vAlign w:val="center"/>
           </w:tcPr>
           <w:p>
             <w:pPr>
@@ -2396,6 +2411,7 @@
           </w:tcPr>
           <w:p>
             <w:pPr>
+              <w:jc w:val="center"/>
               <w:rPr>
                 <w:sz w:val="15"/>
                 <w:szCs w:val="15"/>
@@ -2656,11 +2672,13 @@
         <w:tc>
           <w:tcPr>
             <w:tcW w:w="4826" w:type="dxa"/>
+            <w:vAlign w:val="center"/>
           </w:tcPr>
           <w:p>
             <w:pPr>
               <w:pStyle w:val="TableParagraph"/>
               <w:ind w:left="17"/>
+              <w:jc w:val="left"/>
               <w:rPr>
                 <w:sz w:val="15"/>
               </w:rPr>
@@ -2704,7 +2722,6 @@
             <w:pPr>
               <w:pStyle w:val="TableParagraph"/>
               <w:ind w:left="109"/>
-              <w:jc w:val="left"/>
               <w:rPr>
                 <w:sz w:val="15"/>
               </w:rPr>
@@ -2741,6 +2758,7 @@
         <w:tc>
           <w:tcPr>
             <w:tcW w:w="4826" w:type="dxa"/>
+            <w:vAlign w:val="center"/>
           </w:tcPr>
           <w:p>
             <w:pPr>
@@ -2809,6 +2827,7 @@
           </w:tcPr>
           <w:p>
             <w:pPr>
+              <w:jc w:val="center"/>
               <w:rPr>
                 <w:sz w:val="15"/>
                 <w:szCs w:val="15"/>
@@ -2853,6 +2872,7 @@
         <w:tc>
           <w:tcPr>
             <w:tcW w:w="4826" w:type="dxa"/>
+            <w:vAlign w:val="center"/>
           </w:tcPr>
           <w:p>
             <w:pPr>
@@ -2900,6 +2920,7 @@
           </w:tcPr>
           <w:p>
             <w:pPr>
+              <w:jc w:val="center"/>
               <w:rPr>
                 <w:sz w:val="15"/>
                 <w:szCs w:val="15"/>
@@ -3151,11 +3172,13 @@
         <w:tc>
           <w:tcPr>
             <w:tcW w:w="4826" w:type="dxa"/>
+            <w:vAlign w:val="center"/>
           </w:tcPr>
           <w:p>
             <w:pPr>
               <w:pStyle w:val="TableParagraph"/>
               <w:ind w:left="17"/>
+              <w:jc w:val="left"/>
               <w:rPr>
                 <w:sz w:val="15"/>
               </w:rPr>
@@ -3199,7 +3222,6 @@
             <w:pPr>
               <w:pStyle w:val="TableParagraph"/>
               <w:ind w:left="109"/>
-              <w:jc w:val="left"/>
               <w:rPr>
                 <w:sz w:val="15"/>
               </w:rPr>
@@ -3236,6 +3258,7 @@
         <w:tc>
           <w:tcPr>
             <w:tcW w:w="4826" w:type="dxa"/>
+            <w:vAlign w:val="center"/>
           </w:tcPr>
           <w:p>
             <w:pPr>
@@ -3304,6 +3327,7 @@
           </w:tcPr>
           <w:p>
             <w:pPr>
+              <w:jc w:val="center"/>
               <w:rPr>
                 <w:sz w:val="15"/>
                 <w:szCs w:val="15"/>
@@ -3348,6 +3372,7 @@
         <w:tc>
           <w:tcPr>
             <w:tcW w:w="4826" w:type="dxa"/>
+            <w:vAlign w:val="center"/>
           </w:tcPr>
           <w:p>
             <w:pPr>
@@ -3395,6 +3420,7 @@
           </w:tcPr>
           <w:p>
             <w:pPr>
+              <w:jc w:val="center"/>
               <w:rPr>
                 <w:sz w:val="15"/>
                 <w:szCs w:val="15"/>
@@ -3824,7 +3850,7 @@
           </mc:Choice>
           <mc:Fallback>
             <w:pict>
-              <v:shape w14:anchorId="6A103194" id="Graphic 5" o:spid="_x0000_s1026" style="position:absolute;margin-left:182.75pt;margin-top:14.8pt;width:74.9pt;height:.1pt;z-index:-15726592;visibility:visible;mso-wrap-style:square;mso-wrap-distance-left:0;mso-wrap-distance-top:0;mso-wrap-distance-right:0;mso-wrap-distance-bottom:0;mso-position-horizontal:absolute;mso-position-horizontal-relative:page;mso-position-vertical:absolute;mso-position-vertical-relative:text;v-text-anchor:top" coordsize="951230,1270" o:gfxdata="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" path="m,l951163,e" filled="f" strokeweight=".20497mm">
+              <v:shape w14:anchorId="3F1BEE79" id="Graphic 5" o:spid="_x0000_s1026" style="position:absolute;margin-left:182.75pt;margin-top:14.8pt;width:74.9pt;height:.1pt;z-index:-15726592;visibility:visible;mso-wrap-style:square;mso-wrap-distance-left:0;mso-wrap-distance-top:0;mso-wrap-distance-right:0;mso-wrap-distance-bottom:0;mso-position-horizontal:absolute;mso-position-horizontal-relative:page;mso-position-vertical:absolute;mso-position-vertical-relative:text;v-text-anchor:top" coordsize="951230,1270" o:gfxdata="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" path="m,l951163,e" filled="f" strokeweight=".20497mm">
                 <v:path arrowok="t"/>
                 <w10:wrap type="topAndBottom" anchorx="page"/>
               </v:shape>
@@ -3904,7 +3930,7 @@
           </mc:Choice>
           <mc:Fallback>
             <w:pict>
-              <v:shape w14:anchorId="557D67FA" id="Graphic 6" o:spid="_x0000_s1026" style="position:absolute;margin-left:583.15pt;margin-top:14.8pt;width:74.9pt;height:.1pt;z-index:-15726080;visibility:visible;mso-wrap-style:square;mso-wrap-distance-left:0;mso-wrap-distance-top:0;mso-wrap-distance-right:0;mso-wrap-distance-bottom:0;mso-position-horizontal:absolute;mso-position-horizontal-relative:page;mso-position-vertical:absolute;mso-position-vertical-relative:text;v-text-anchor:top" coordsize="951230,1270" o:gfxdata="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" path="m,l951163,e" filled="f" strokeweight=".20497mm">
+              <v:shape w14:anchorId="7A87DE6B" id="Graphic 6" o:spid="_x0000_s1026" style="position:absolute;margin-left:583.15pt;margin-top:14.8pt;width:74.9pt;height:.1pt;z-index:-15726080;visibility:visible;mso-wrap-style:square;mso-wrap-distance-left:0;mso-wrap-distance-top:0;mso-wrap-distance-right:0;mso-wrap-distance-bottom:0;mso-position-horizontal:absolute;mso-position-horizontal-relative:page;mso-position-vertical:absolute;mso-position-vertical-relative:text;v-text-anchor:top" coordsize="951230,1270" o:gfxdata="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" path="m,l951163,e" filled="f" strokeweight=".20497mm">
                 <v:path arrowok="t"/>
                 <w10:wrap type="topAndBottom" anchorx="page"/>
               </v:shape>

</xml_diff>